<commit_message>
cool intellij ide stuff
</commit_message>
<xml_diff>
--- a/Isaac Morley Site Plan Nullpoint Studio.docx
+++ b/Isaac Morley Site Plan Nullpoint Studio.docx
@@ -10,11 +10,19 @@
           <w:rFonts w:eastAsia="Times New Roman"/>
         </w:rPr>
       </w:pPr>
-      <w:r>
-        <w:rPr>
-          <w:rFonts w:eastAsia="Times New Roman"/>
-        </w:rPr>
-        <w:t xml:space="preserve">Nullpoint Studio </w:t>
+      <w:proofErr w:type="spellStart"/>
+      <w:r>
+        <w:rPr>
+          <w:rFonts w:eastAsia="Times New Roman"/>
+        </w:rPr>
+        <w:t>Nullpoint</w:t>
+      </w:r>
+      <w:proofErr w:type="spellEnd"/>
+      <w:r>
+        <w:rPr>
+          <w:rFonts w:eastAsia="Times New Roman"/>
+        </w:rPr>
+        <w:t xml:space="preserve"> Studio </w:t>
       </w:r>
       <w:r>
         <w:rPr>
@@ -136,20 +144,19 @@
           <w:sz w:val="24"/>
           <w:szCs w:val="24"/>
         </w:rPr>
-        <w:t xml:space="preserve"> about Nullpoint Studio, which is my independent developer brand, in which I design and build mobile apps. The recent app has been focused on Self Improvement and Personal Growth. The site will introduce the studio, show the apps I am building, and explain why I'm creating the apps to help people develop discipline, track progress, and improve their lives.</w:t>
-      </w:r>
-    </w:p>
-    <w:p>
-      <w:pPr>
-        <w:pStyle w:val="Heading3"/>
-        <w:jc w:val="center"/>
+        <w:t xml:space="preserve"> about </w:t>
+      </w:r>
+      <w:proofErr w:type="spellStart"/>
+      <w:r>
         <w:rPr>
           <w:b w:val="0"/>
           <w:bCs w:val="0"/>
           <w:sz w:val="24"/>
           <w:szCs w:val="24"/>
         </w:rPr>
-      </w:pPr>
+        <w:t>Nullpoint</w:t>
+      </w:r>
+      <w:proofErr w:type="spellEnd"/>
       <w:r>
         <w:rPr>
           <w:b w:val="0"/>
@@ -157,7 +164,7 @@
           <w:sz w:val="24"/>
           <w:szCs w:val="24"/>
         </w:rPr>
-        <w:t>The website also serves as a central place where users can learn about my current projects, understand the purpose behind the apps, and follow the growth of Nullpoint Studio as I continue developing new software.</w:t>
+        <w:t xml:space="preserve"> Studio, which is my independent developer brand, in which I design and build mobile apps. The recent app has been focused on Self Improvement and Personal Growth. The site will introduce the studio, show the apps I am building, and explain why I'm creating the apps to help people develop discipline, track progress, and improve their lives.</w:t>
       </w:r>
     </w:p>
     <w:p>
@@ -165,6 +172,47 @@
         <w:pStyle w:val="Heading3"/>
         <w:jc w:val="center"/>
         <w:rPr>
+          <w:b w:val="0"/>
+          <w:bCs w:val="0"/>
+          <w:sz w:val="24"/>
+          <w:szCs w:val="24"/>
+        </w:rPr>
+      </w:pPr>
+      <w:r>
+        <w:rPr>
+          <w:b w:val="0"/>
+          <w:bCs w:val="0"/>
+          <w:sz w:val="24"/>
+          <w:szCs w:val="24"/>
+        </w:rPr>
+        <w:t xml:space="preserve">The website also serves as a central place where users can learn about my current projects, understand the purpose behind the apps, and follow the growth of </w:t>
+      </w:r>
+      <w:proofErr w:type="spellStart"/>
+      <w:r>
+        <w:rPr>
+          <w:b w:val="0"/>
+          <w:bCs w:val="0"/>
+          <w:sz w:val="24"/>
+          <w:szCs w:val="24"/>
+        </w:rPr>
+        <w:t>Nullpoint</w:t>
+      </w:r>
+      <w:proofErr w:type="spellEnd"/>
+      <w:r>
+        <w:rPr>
+          <w:b w:val="0"/>
+          <w:bCs w:val="0"/>
+          <w:sz w:val="24"/>
+          <w:szCs w:val="24"/>
+        </w:rPr>
+        <w:t xml:space="preserve"> Studio as I continue developing new software.</w:t>
+      </w:r>
+    </w:p>
+    <w:p>
+      <w:pPr>
+        <w:pStyle w:val="Heading3"/>
+        <w:jc w:val="center"/>
+        <w:rPr>
           <w:rFonts w:eastAsia="Times New Roman"/>
         </w:rPr>
       </w:pPr>
@@ -189,7 +237,15 @@
         <w:t>self-improvement</w:t>
       </w:r>
       <w:r>
-        <w:t>, discipline, habit building, and productivity tools. The audience also includes students, other developers, and technology enthusiasts who are interested in learning about independent software development and following the progress of projects being built under the Nullpoint Studio name.</w:t>
+        <w:t xml:space="preserve">, discipline, habit building, and productivity tools. The audience also includes students, other developers, and technology enthusiasts who are interested in learning about independent software development and following the progress of projects being built under the </w:t>
+      </w:r>
+      <w:proofErr w:type="spellStart"/>
+      <w:r>
+        <w:t>Nullpoint</w:t>
+      </w:r>
+      <w:proofErr w:type="spellEnd"/>
+      <w:r>
+        <w:t xml:space="preserve"> Studio name.</w:t>
       </w:r>
       <w:r>
         <w:rPr>
@@ -640,12 +696,14 @@
         </w:rPr>
         <w:t xml:space="preserve">Heading Font: </w:t>
       </w:r>
+      <w:proofErr w:type="spellStart"/>
       <w:r>
         <w:rPr>
           <w:rFonts w:eastAsia="Times New Roman"/>
         </w:rPr>
         <w:t>Orbitron</w:t>
       </w:r>
+      <w:proofErr w:type="spellEnd"/>
     </w:p>
     <w:p>
       <w:pPr>
@@ -877,7 +935,21 @@
         <w:rPr>
           <w:rFonts w:eastAsia="Times New Roman"/>
         </w:rPr>
-        <w:t>The purpose of the homepage is to introduce visitors to Nullpoint Studio and explain what the studio builds.</w:t>
+        <w:t xml:space="preserve">The purpose of the homepage is to introduce visitors to </w:t>
+      </w:r>
+      <w:proofErr w:type="spellStart"/>
+      <w:r>
+        <w:rPr>
+          <w:rFonts w:eastAsia="Times New Roman"/>
+        </w:rPr>
+        <w:t>Nullpoint</w:t>
+      </w:r>
+      <w:proofErr w:type="spellEnd"/>
+      <w:r>
+        <w:rPr>
+          <w:rFonts w:eastAsia="Times New Roman"/>
+        </w:rPr>
+        <w:t xml:space="preserve"> Studio and explain what the studio builds.</w:t>
       </w:r>
     </w:p>
     <w:p>
@@ -909,15 +981,47 @@
         <w:rPr>
           <w:rFonts w:eastAsia="Times New Roman"/>
         </w:rPr>
-        <w:t xml:space="preserve">The homepage will begin with a hero section displaying the Nullpoint Studio logo and a short tagline such as </w:t>
-      </w:r>
-      <w:r>
-        <w:rPr>
-          <w:rFonts w:eastAsia="Times New Roman"/>
-          <w:b/>
-          <w:bCs/>
-        </w:rPr>
-        <w:t>“Mobile Apps for Self Improvement.”</w:t>
+        <w:t xml:space="preserve">The homepage will begin with a hero section displaying the </w:t>
+      </w:r>
+      <w:proofErr w:type="spellStart"/>
+      <w:r>
+        <w:rPr>
+          <w:rFonts w:eastAsia="Times New Roman"/>
+        </w:rPr>
+        <w:t>Nullpoint</w:t>
+      </w:r>
+      <w:proofErr w:type="spellEnd"/>
+      <w:r>
+        <w:rPr>
+          <w:rFonts w:eastAsia="Times New Roman"/>
+        </w:rPr>
+        <w:t xml:space="preserve"> Studio logo and a short tagline such as </w:t>
+      </w:r>
+      <w:r>
+        <w:rPr>
+          <w:rFonts w:eastAsia="Times New Roman"/>
+          <w:b/>
+          <w:bCs/>
+        </w:rPr>
+        <w:t xml:space="preserve">“Mobile Apps for </w:t>
+      </w:r>
+      <w:proofErr w:type="spellStart"/>
+      <w:r>
+        <w:rPr>
+          <w:rFonts w:eastAsia="Times New Roman"/>
+          <w:b/>
+          <w:bCs/>
+        </w:rPr>
+        <w:t>Self Improvement</w:t>
+      </w:r>
+      <w:proofErr w:type="spellEnd"/>
+      <w:r>
+        <w:rPr>
+          <w:rFonts w:eastAsia="Times New Roman"/>
+          <w:b/>
+          <w:bCs/>
+        </w:rPr>
+        <w:t>.”</w:t>
       </w:r>
     </w:p>
     <w:p>
@@ -932,7 +1036,21 @@
           <w:rFonts w:eastAsia="Times New Roman"/>
         </w:rPr>
         <w:lastRenderedPageBreak/>
-        <w:t>Below the hero section, the page will introduce the mission of the studio and explain that the goal of Nullpoint Studio is to create software that helps people develop discipline and improve themselves.</w:t>
+        <w:t xml:space="preserve">Below the hero section, the page will introduce the mission of the studio and explain that the goal of </w:t>
+      </w:r>
+      <w:proofErr w:type="spellStart"/>
+      <w:r>
+        <w:rPr>
+          <w:rFonts w:eastAsia="Times New Roman"/>
+        </w:rPr>
+        <w:t>Nullpoint</w:t>
+      </w:r>
+      <w:proofErr w:type="spellEnd"/>
+      <w:r>
+        <w:rPr>
+          <w:rFonts w:eastAsia="Times New Roman"/>
+        </w:rPr>
+        <w:t xml:space="preserve"> Studio is to create software that helps people develop discipline and improve themselves.</w:t>
       </w:r>
     </w:p>
     <w:p>
@@ -974,11 +1092,19 @@
           <w:rFonts w:eastAsia="Times New Roman"/>
         </w:rPr>
       </w:pPr>
-      <w:r>
-        <w:rPr>
-          <w:rFonts w:eastAsia="Times New Roman"/>
-        </w:rPr>
-        <w:t>Nullpoint Studio logo</w:t>
+      <w:proofErr w:type="spellStart"/>
+      <w:r>
+        <w:rPr>
+          <w:rFonts w:eastAsia="Times New Roman"/>
+        </w:rPr>
+        <w:t>Nullpoint</w:t>
+      </w:r>
+      <w:proofErr w:type="spellEnd"/>
+      <w:r>
+        <w:rPr>
+          <w:rFonts w:eastAsia="Times New Roman"/>
+        </w:rPr>
+        <w:t xml:space="preserve"> Studio logo</w:t>
       </w:r>
       <w:r>
         <w:rPr>
@@ -1050,7 +1176,21 @@
         <w:rPr>
           <w:rFonts w:eastAsia="Times New Roman"/>
         </w:rPr>
-        <w:t>The purpose of the About page is to explain what Nullpoint Studio is and the vision behind the studio.</w:t>
+        <w:t xml:space="preserve">The purpose of the About page is to explain what </w:t>
+      </w:r>
+      <w:proofErr w:type="spellStart"/>
+      <w:r>
+        <w:rPr>
+          <w:rFonts w:eastAsia="Times New Roman"/>
+        </w:rPr>
+        <w:t>Nullpoint</w:t>
+      </w:r>
+      <w:proofErr w:type="spellEnd"/>
+      <w:r>
+        <w:rPr>
+          <w:rFonts w:eastAsia="Times New Roman"/>
+        </w:rPr>
+        <w:t xml:space="preserve"> Studio is and the vision behind the studio.</w:t>
       </w:r>
     </w:p>
     <w:p>
@@ -1082,21 +1222,49 @@
         <w:rPr>
           <w:rFonts w:eastAsia="Times New Roman"/>
         </w:rPr>
-        <w:t>This page will describe why Nullpoint Studio was created and what the studio represents. It will explain that the studio is the name used for my independent development work and represents the apps and tools I create while continuing to grow as a developer.</w:t>
-      </w:r>
-    </w:p>
-    <w:p>
-      <w:pPr>
-        <w:jc w:val="center"/>
-        <w:rPr>
-          <w:rFonts w:eastAsia="Times New Roman"/>
-        </w:rPr>
-      </w:pPr>
-      <w:r>
-        <w:rPr>
-          <w:rFonts w:eastAsia="Times New Roman"/>
-        </w:rPr>
-        <w:t>The page will also explain the long term vision of building useful software that helps people stay disciplined, track progress, and improve themselves over time.</w:t>
+        <w:t xml:space="preserve">This page will describe why </w:t>
+      </w:r>
+      <w:proofErr w:type="spellStart"/>
+      <w:r>
+        <w:rPr>
+          <w:rFonts w:eastAsia="Times New Roman"/>
+        </w:rPr>
+        <w:t>Nullpoint</w:t>
+      </w:r>
+      <w:proofErr w:type="spellEnd"/>
+      <w:r>
+        <w:rPr>
+          <w:rFonts w:eastAsia="Times New Roman"/>
+        </w:rPr>
+        <w:t xml:space="preserve"> Studio was created and what the studio represents. It will explain that the studio is the name used for my independent development work and represents the apps and tools I create while continuing to grow as a developer.</w:t>
+      </w:r>
+    </w:p>
+    <w:p>
+      <w:pPr>
+        <w:jc w:val="center"/>
+        <w:rPr>
+          <w:rFonts w:eastAsia="Times New Roman"/>
+        </w:rPr>
+      </w:pPr>
+      <w:r>
+        <w:rPr>
+          <w:rFonts w:eastAsia="Times New Roman"/>
+        </w:rPr>
+        <w:t xml:space="preserve">The page will also explain the </w:t>
+      </w:r>
+      <w:proofErr w:type="gramStart"/>
+      <w:r>
+        <w:rPr>
+          <w:rFonts w:eastAsia="Times New Roman"/>
+        </w:rPr>
+        <w:t>long term</w:t>
+      </w:r>
+      <w:proofErr w:type="gramEnd"/>
+      <w:r>
+        <w:rPr>
+          <w:rFonts w:eastAsia="Times New Roman"/>
+        </w:rPr>
+        <w:t xml:space="preserve"> vision of building useful software that helps people stay disciplined, track progress, and improve themselves over time.</w:t>
       </w:r>
     </w:p>
     <w:p>
@@ -1191,7 +1359,21 @@
           <w:rFonts w:eastAsia="Times New Roman"/>
         </w:rPr>
         <w:br/>
-        <w:t>The purpose of the Apps page is to showcase the mobile applications created under Nullpoint Studio.</w:t>
+        <w:t xml:space="preserve">The purpose of the Apps page is to showcase the mobile applications created under </w:t>
+      </w:r>
+      <w:proofErr w:type="spellStart"/>
+      <w:r>
+        <w:rPr>
+          <w:rFonts w:eastAsia="Times New Roman"/>
+        </w:rPr>
+        <w:t>Nullpoint</w:t>
+      </w:r>
+      <w:proofErr w:type="spellEnd"/>
+      <w:r>
+        <w:rPr>
+          <w:rFonts w:eastAsia="Times New Roman"/>
+        </w:rPr>
+        <w:t xml:space="preserve"> Studio.</w:t>
       </w:r>
     </w:p>
     <w:p>
@@ -2704,6 +2886,15 @@
 </file>
 
 <file path=customXml/item1.xml><?xml version="1.0" encoding="utf-8"?>
+<?mso-contentType ?>
+<FormTemplates xmlns="http://schemas.microsoft.com/sharepoint/v3/contenttype/forms">
+  <Display>DocumentLibraryForm</Display>
+  <Edit>DocumentLibraryForm</Edit>
+  <New>DocumentLibraryForm</New>
+</FormTemplates>
+</file>
+
+<file path=customXml/item2.xml><?xml version="1.0" encoding="utf-8"?>
 <ct:contentTypeSchema xmlns:ct="http://schemas.microsoft.com/office/2006/metadata/contentType" xmlns:ma="http://schemas.microsoft.com/office/2006/metadata/properties/metaAttributes" ct:_="" ma:_="" ma:contentTypeName="Document" ma:contentTypeID="0x01010070786A3B13EA5B4EAE9A80CDEE24C6FF" ma:contentTypeVersion="6" ma:contentTypeDescription="Create a new document." ma:contentTypeScope="" ma:versionID="516c6e28e2f9900520dff6eaae692d5c">
   <xsd:schema xmlns:xsd="http://www.w3.org/2001/XMLSchema" xmlns:xs="http://www.w3.org/2001/XMLSchema" xmlns:p="http://schemas.microsoft.com/office/2006/metadata/properties" xmlns:ns3="17134c8d-ec91-451d-b8f3-fd780c5e193a" targetNamespace="http://schemas.microsoft.com/office/2006/metadata/properties" ma:root="true" ma:fieldsID="ac1d10cb353eafed014382f714ad4a73" ns3:_="">
     <xsd:import namespace="17134c8d-ec91-451d-b8f3-fd780c5e193a"/>
@@ -2859,15 +3050,6 @@
 </ct:contentTypeSchema>
 </file>
 
-<file path=customXml/item2.xml><?xml version="1.0" encoding="utf-8"?>
-<?mso-contentType ?>
-<FormTemplates xmlns="http://schemas.microsoft.com/sharepoint/v3/contenttype/forms">
-  <Display>DocumentLibraryForm</Display>
-  <Edit>DocumentLibraryForm</Edit>
-  <New>DocumentLibraryForm</New>
-</FormTemplates>
-</file>
-
 <file path=customXml/item3.xml><?xml version="1.0" encoding="utf-8"?>
 <p:properties xmlns:p="http://schemas.microsoft.com/office/2006/metadata/properties" xmlns:xsi="http://www.w3.org/2001/XMLSchema-instance" xmlns:pc="http://schemas.microsoft.com/office/infopath/2007/PartnerControls">
   <documentManagement>
@@ -2877,6 +3059,14 @@
 </file>
 
 <file path=customXml/itemProps1.xml><?xml version="1.0" encoding="utf-8"?>
+<ds:datastoreItem xmlns:ds="http://schemas.openxmlformats.org/officeDocument/2006/customXml" ds:itemID="{29F94B81-F3A0-4270-857E-31472C1CD7F5}">
+  <ds:schemaRefs>
+    <ds:schemaRef ds:uri="http://schemas.microsoft.com/sharepoint/v3/contenttype/forms"/>
+  </ds:schemaRefs>
+</ds:datastoreItem>
+</file>
+
+<file path=customXml/itemProps2.xml><?xml version="1.0" encoding="utf-8"?>
 <ds:datastoreItem xmlns:ds="http://schemas.openxmlformats.org/officeDocument/2006/customXml" ds:itemID="{E7BC259D-7873-49EA-A611-304D83508A34}">
   <ds:schemaRefs>
     <ds:schemaRef ds:uri="http://schemas.microsoft.com/office/2006/metadata/contentType"/>
@@ -2894,14 +3084,6 @@
 </ds:datastoreItem>
 </file>
 
-<file path=customXml/itemProps2.xml><?xml version="1.0" encoding="utf-8"?>
-<ds:datastoreItem xmlns:ds="http://schemas.openxmlformats.org/officeDocument/2006/customXml" ds:itemID="{29F94B81-F3A0-4270-857E-31472C1CD7F5}">
-  <ds:schemaRefs>
-    <ds:schemaRef ds:uri="http://schemas.microsoft.com/sharepoint/v3/contenttype/forms"/>
-  </ds:schemaRefs>
-</ds:datastoreItem>
-</file>
-
 <file path=customXml/itemProps3.xml><?xml version="1.0" encoding="utf-8"?>
 <ds:datastoreItem xmlns:ds="http://schemas.openxmlformats.org/officeDocument/2006/customXml" ds:itemID="{38E25108-0AF9-42E5-8FD4-B2C7F838073C}">
   <ds:schemaRefs>

</xml_diff>